<commit_message>
Refresh LinkedIn opening banner across L-001..L-010
Replaces the role-specific "Day N of a 171-lesson path from zero to a
Principal Artificial Intelligence (AI) Architect role" tagline with a
neutral title/subtitle banner plus an explicit module descriptor:

  **From zero technical knowledge to AI literacy.**
  Through data, cloud, MLOps, and applied GenAI systems.

  Day N of 171. Module X: <Module Title> (Day M[, capstone]).

Updates all 10 LinkedIn markdown files and their embedded _deliverables/
docx counterparts. Adds an "Opening banner" spec to the skill's
assembly_phase.md so every future lesson bakes the same format in.
Narrow scope by request: body-copy role mentions and closing hashtags
left intact for this pass.

Co-Authored-By: Claude Opus 4.7 (1M context) <noreply@anthropic.com>
</commit_message>
<xml_diff>
--- a/_deliverables/L-001-post.docx
+++ b/_deliverables/L-001-post.docx
@@ -84,7 +84,44 @@
         <w:spacing w:after="80" w:before="80" w:line="300"/>
       </w:pPr>
       <w:r>
-        <w:t xml:space="preserve">This is Day 1 of a 171-lesson path I am taking publicly, from zero to a Principal Artificial Intelligence (AI) Architect role. Week one is the command line. Lesson one is the keyboard shortcut that opens the terminal on any operating system you are likely to have in front of you. It is ten minutes of work. It is the single highest-payoff keyboard motion in the whole field, and I skipped past it for years because I thought "learning the terminal" started with commands.</w:t>
+        <w:rPr>
+          <w:rFonts w:ascii="Calibri" w:hAnsi="Calibri" w:cs="Calibri"/>
+          <w:b/>
+          <w:sz w:val="22"/>
+        </w:rPr>
+        <w:t xml:space="preserve">From zero technical knowledge to AI literacy.</w:t>
+      </w:r>
+    </w:p>
+    <w:p>
+      <w:pPr>
+        <w:spacing w:after="80" w:before="80" w:line="300"/>
+      </w:pPr>
+      <w:r>
+        <w:rPr>
+          <w:rFonts w:ascii="Calibri" w:hAnsi="Calibri" w:cs="Calibri"/>
+          <w:sz w:val="22"/>
+        </w:rPr>
+        <w:t xml:space="preserve">Through data, cloud, MLOps, and applied GenAI systems.</w:t>
+      </w:r>
+    </w:p>
+    <w:p>
+      <w:pPr>
+        <w:spacing w:after="80" w:before="80" w:line="300"/>
+      </w:pPr>
+      <w:r>
+        <w:rPr>
+          <w:rFonts w:ascii="Calibri" w:hAnsi="Calibri" w:cs="Calibri"/>
+          <w:sz w:val="22"/>
+        </w:rPr>
+        <w:t xml:space="preserve">Day 1 of 171. Module 1: First Contact with the Terminal (Day 1).</w:t>
+      </w:r>
+    </w:p>
+    <w:p>
+      <w:pPr>
+        <w:spacing w:after="80" w:before="80" w:line="300"/>
+      </w:pPr>
+      <w:r>
+        <w:t>Lesson one is the keyboard shortcut that opens the terminal on any operating system you are likely to have in front of you. It is ten minutes of work. It is the single highest-payoff keyboard motion in the whole field, and I skipped past it for years because I thought "learning the terminal" started with commands.</w:t>
       </w:r>
     </w:p>
     <w:p>

</xml_diff>